<commit_message>
update: Motify content on session 1 and session 2 for final submission file
</commit_message>
<xml_diff>
--- a/02.FINAL_SPACE/FINAL_SUBMISSION/25410232_TranNgocHuy_25410198_TranVietHai_25410203_DangVanHau_25410233_TranNguyenGiaHuy_25410194_NguyenThanhDuy_25410246_HuynhDaiLong_25410230_NguyenThanhHuy_Nhom8_BaoCao.docx
+++ b/02.FINAL_SPACE/FINAL_SUBMISSION/25410232_TranNgocHuy_25410198_TranVietHai_25410203_DangVanHau_25410233_TranNguyenGiaHuy_25410194_NguyenThanhDuy_25410246_HuynhDaiLong_25410230_NguyenThanhHuy_Nhom8_BaoCao.docx
@@ -285,7 +285,7 @@
           <w:sz w:val="28"/>
           <w:szCs w:val="28"/>
         </w:rPr>
-        <w:t xml:space="preserve">Danh sách nhóm: Toàn bộ sinh viên trong danh sách nhóm</w:t>
+        <w:t xml:space="preserve">Nhóm 8</w:t>
       </w:r>
     </w:p>
     <w:p>
@@ -416,6 +416,7 @@
           <w:tr>
             <w:trPr>
               <w:jc w:val="center"/>
+              <w:cantSplit/>
             </w:trPr>
             <w:tc>
               <w:tcPr>
@@ -493,6 +494,7 @@
           <w:tr>
             <w:trPr>
               <w:jc w:val="center"/>
+              <w:cantSplit/>
             </w:trPr>
             <w:tc>
               <w:tcPr>
@@ -562,6 +564,7 @@
           <w:tr>
             <w:trPr>
               <w:jc w:val="center"/>
+              <w:cantSplit/>
             </w:trPr>
             <w:tc>
               <w:tcPr>
@@ -631,6 +634,7 @@
           <w:tr>
             <w:trPr>
               <w:jc w:val="center"/>
+              <w:cantSplit/>
             </w:trPr>
             <w:tc>
               <w:tcPr>
@@ -700,6 +704,7 @@
           <w:tr>
             <w:trPr>
               <w:jc w:val="center"/>
+              <w:cantSplit/>
             </w:trPr>
             <w:tc>
               <w:tcPr>
@@ -769,6 +774,7 @@
           <w:tr>
             <w:trPr>
               <w:jc w:val="center"/>
+              <w:cantSplit/>
             </w:trPr>
             <w:tc>
               <w:tcPr>
@@ -838,6 +844,7 @@
           <w:tr>
             <w:trPr>
               <w:jc w:val="center"/>
+              <w:cantSplit/>
             </w:trPr>
             <w:tc>
               <w:tcPr>
@@ -907,6 +914,7 @@
           <w:tr>
             <w:trPr>
               <w:jc w:val="center"/>
+              <w:cantSplit/>
             </w:trPr>
             <w:tc>
               <w:tcPr>
@@ -2951,7 +2959,7 @@
           <w:sz w:val="24"/>
           <w:szCs w:val="24"/>
         </w:rPr>
-        <w:t xml:space="preserve">Hình 1. 1 Sơ đồ hệ sinh thái dịch vụ logistics Viettel Post</w:t>
+        <w:t xml:space="preserve">Hình 1.1 Sơ đồ hệ sinh thái dịch vụ logistics Viettel Post</w:t>
       </w:r>
     </w:p>
     <w:p>
@@ -3262,7 +3270,7 @@
           <w:sz w:val="24"/>
           <w:szCs w:val="24"/>
         </w:rPr>
-        <w:t xml:space="preserve">Hình 1. 2 Sơ đồ cơ cấu tổ chức</w:t>
+        <w:t xml:space="preserve">Hình 1.2 Sơ đồ cơ cấu tổ chức</w:t>
       </w:r>
     </w:p>
     <w:p>
@@ -3676,7 +3684,7 @@
           <w:sz w:val="24"/>
           <w:szCs w:val="24"/>
         </w:rPr>
-        <w:t xml:space="preserve">Hình 2. 1 Sơ đồ kiến trúc quy trình nghiệp vụ Viettel Post</w:t>
+        <w:t xml:space="preserve">Hình 2.1 Sơ đồ kiến trúc quy trình nghiệp vụ Viettel Post</w:t>
       </w:r>
     </w:p>
     <w:p>
@@ -5010,7 +5018,7 @@
           <w:sz w:val="24"/>
           <w:szCs w:val="24"/>
         </w:rPr>
-        <w:t xml:space="preserve">Bảng 3. 1 Danh mục tài liệu và minh chứng quy trình</w:t>
+        <w:t xml:space="preserve">Bảng 3.1 Danh mục tài liệu và minh chứng quy trình</w:t>
       </w:r>
     </w:p>
     <w:tbl>
@@ -5042,6 +5050,7 @@
         <w:trPr>
           <w:jc w:val="center"/>
           <w:tblHeader/>
+          <w:cantSplit/>
         </w:trPr>
         <w:tc>
           <w:tcPr>
@@ -5219,6 +5228,9 @@
         </w:tc>
       </w:tr>
       <w:tr>
+        <w:trPr>
+          <w:cantSplit/>
+        </w:trPr>
         <w:tc>
           <w:tcPr>
             <w:tcW w:w="500" w:type="dxa"/>
@@ -5383,6 +5395,9 @@
         </w:tc>
       </w:tr>
       <w:tr>
+        <w:trPr>
+          <w:cantSplit/>
+        </w:trPr>
         <w:tc>
           <w:tcPr>
             <w:tcW w:w="500" w:type="dxa"/>
@@ -5547,6 +5562,9 @@
         </w:tc>
       </w:tr>
       <w:tr>
+        <w:trPr>
+          <w:cantSplit/>
+        </w:trPr>
         <w:tc>
           <w:tcPr>
             <w:tcW w:w="500" w:type="dxa"/>
@@ -5711,6 +5729,9 @@
         </w:tc>
       </w:tr>
       <w:tr>
+        <w:trPr>
+          <w:cantSplit/>
+        </w:trPr>
         <w:tc>
           <w:tcPr>
             <w:tcW w:w="500" w:type="dxa"/>
@@ -5875,6 +5896,9 @@
         </w:tc>
       </w:tr>
       <w:tr>
+        <w:trPr>
+          <w:cantSplit/>
+        </w:trPr>
         <w:tc>
           <w:tcPr>
             <w:tcW w:w="500" w:type="dxa"/>
@@ -6039,6 +6063,9 @@
         </w:tc>
       </w:tr>
       <w:tr>
+        <w:trPr>
+          <w:cantSplit/>
+        </w:trPr>
         <w:tc>
           <w:tcPr>
             <w:tcW w:w="500" w:type="dxa"/>
@@ -6203,6 +6230,9 @@
         </w:tc>
       </w:tr>
       <w:tr>
+        <w:trPr>
+          <w:cantSplit/>
+        </w:trPr>
         <w:tc>
           <w:tcPr>
             <w:tcW w:w="500" w:type="dxa"/>
@@ -6367,6 +6397,9 @@
         </w:tc>
       </w:tr>
       <w:tr>
+        <w:trPr>
+          <w:cantSplit/>
+        </w:trPr>
         <w:tc>
           <w:tcPr>
             <w:tcW w:w="500" w:type="dxa"/>
@@ -6577,7 +6610,7 @@
           <w:sz w:val="26"/>
           <w:szCs w:val="26"/>
         </w:rPr>
-        <w:t xml:space="preserve">Sơ đồ tổ chức của Viettel Post — căn cứ để xác định các actor và đối tượng phỏng vấn trong Mục 3.2 — đã được trình bày tại Hình 1. 2 (Mục 1.2.1, Chương 1). Sơ đồ thể hiện ba khối vận hành chính (khối tham mưu, khối kinh doanh, khối triển khai) cùng mối quan hệ chỉ đạo và phối hợp giữa các phòng ban, làm cơ sở đối chiếu actor trong mô tả quy trình với pool/lane trên sơ đồ BPMN.</w:t>
+        <w:t xml:space="preserve">Sơ đồ tổ chức của Viettel Post — căn cứ để xác định các actor và đối tượng phỏng vấn trong Mục 3.2 — đã được trình bày tại Hình 1.2 (Mục 1.2.1, Chương 1). Sơ đồ thể hiện ba khối vận hành chính (khối tham mưu, khối kinh doanh, khối triển khai) cùng mối quan hệ chỉ đạo và phối hợp giữa các phòng ban, làm cơ sở đối chiếu actor trong mô tả quy trình với pool/lane trên sơ đồ BPMN.</w:t>
       </w:r>
     </w:p>
     <w:p>
@@ -6675,7 +6708,7 @@
           <w:sz w:val="24"/>
           <w:szCs w:val="24"/>
         </w:rPr>
-        <w:t xml:space="preserve">Hình 3. 1 Kế hoạch làm việc theo ca và theo giai đoạn tích lũy</w:t>
+        <w:t xml:space="preserve">Hình 3.1 Kế hoạch làm việc theo ca và theo giai đoạn tích lũy</w:t>
       </w:r>
     </w:p>
     <w:p>
@@ -6742,7 +6775,7 @@
           <w:sz w:val="24"/>
           <w:szCs w:val="24"/>
         </w:rPr>
-        <w:t xml:space="preserve">Bảng 3. 2 Thuật ngữ và định nghĩa</w:t>
+        <w:t xml:space="preserve">Bảng 3.2 Thuật ngữ và định nghĩa</w:t>
       </w:r>
     </w:p>
     <w:tbl>
@@ -6771,6 +6804,7 @@
         <w:trPr>
           <w:jc w:val="center"/>
           <w:tblHeader/>
+          <w:cantSplit/>
         </w:trPr>
         <w:tc>
           <w:tcPr>
@@ -6861,6 +6895,9 @@
         </w:tc>
       </w:tr>
       <w:tr>
+        <w:trPr>
+          <w:cantSplit/>
+        </w:trPr>
         <w:tc>
           <w:tcPr>
             <w:tcW w:w="2000" w:type="dxa"/>
@@ -6944,6 +6981,9 @@
         </w:tc>
       </w:tr>
       <w:tr>
+        <w:trPr>
+          <w:cantSplit/>
+        </w:trPr>
         <w:tc>
           <w:tcPr>
             <w:tcW w:w="2000" w:type="dxa"/>
@@ -7027,6 +7067,9 @@
         </w:tc>
       </w:tr>
       <w:tr>
+        <w:trPr>
+          <w:cantSplit/>
+        </w:trPr>
         <w:tc>
           <w:tcPr>
             <w:tcW w:w="2000" w:type="dxa"/>
@@ -7110,6 +7153,9 @@
         </w:tc>
       </w:tr>
       <w:tr>
+        <w:trPr>
+          <w:cantSplit/>
+        </w:trPr>
         <w:tc>
           <w:tcPr>
             <w:tcW w:w="2000" w:type="dxa"/>
@@ -7193,6 +7239,9 @@
         </w:tc>
       </w:tr>
       <w:tr>
+        <w:trPr>
+          <w:cantSplit/>
+        </w:trPr>
         <w:tc>
           <w:tcPr>
             <w:tcW w:w="2000" w:type="dxa"/>
@@ -7276,6 +7325,9 @@
         </w:tc>
       </w:tr>
       <w:tr>
+        <w:trPr>
+          <w:cantSplit/>
+        </w:trPr>
         <w:tc>
           <w:tcPr>
             <w:tcW w:w="2000" w:type="dxa"/>
@@ -7359,6 +7411,9 @@
         </w:tc>
       </w:tr>
       <w:tr>
+        <w:trPr>
+          <w:cantSplit/>
+        </w:trPr>
         <w:tc>
           <w:tcPr>
             <w:tcW w:w="2000" w:type="dxa"/>
@@ -7442,6 +7497,9 @@
         </w:tc>
       </w:tr>
       <w:tr>
+        <w:trPr>
+          <w:cantSplit/>
+        </w:trPr>
         <w:tc>
           <w:tcPr>
             <w:tcW w:w="2000" w:type="dxa"/>
@@ -7525,6 +7583,9 @@
         </w:tc>
       </w:tr>
       <w:tr>
+        <w:trPr>
+          <w:cantSplit/>
+        </w:trPr>
         <w:tc>
           <w:tcPr>
             <w:tcW w:w="2000" w:type="dxa"/>
@@ -7608,6 +7669,9 @@
         </w:tc>
       </w:tr>
       <w:tr>
+        <w:trPr>
+          <w:cantSplit/>
+        </w:trPr>
         <w:tc>
           <w:tcPr>
             <w:tcW w:w="2000" w:type="dxa"/>
@@ -7691,6 +7755,9 @@
         </w:tc>
       </w:tr>
       <w:tr>
+        <w:trPr>
+          <w:cantSplit/>
+        </w:trPr>
         <w:tc>
           <w:tcPr>
             <w:tcW w:w="2000" w:type="dxa"/>
@@ -7774,6 +7841,9 @@
         </w:tc>
       </w:tr>
       <w:tr>
+        <w:trPr>
+          <w:cantSplit/>
+        </w:trPr>
         <w:tc>
           <w:tcPr>
             <w:tcW w:w="2000" w:type="dxa"/>
@@ -7857,6 +7927,9 @@
         </w:tc>
       </w:tr>
       <w:tr>
+        <w:trPr>
+          <w:cantSplit/>
+        </w:trPr>
         <w:tc>
           <w:tcPr>
             <w:tcW w:w="2000" w:type="dxa"/>
@@ -7940,6 +8013,9 @@
         </w:tc>
       </w:tr>
       <w:tr>
+        <w:trPr>
+          <w:cantSplit/>
+        </w:trPr>
         <w:tc>
           <w:tcPr>
             <w:tcW w:w="2000" w:type="dxa"/>
@@ -8023,6 +8099,9 @@
         </w:tc>
       </w:tr>
       <w:tr>
+        <w:trPr>
+          <w:cantSplit/>
+        </w:trPr>
         <w:tc>
           <w:tcPr>
             <w:tcW w:w="2000" w:type="dxa"/>
@@ -8106,6 +8185,9 @@
         </w:tc>
       </w:tr>
       <w:tr>
+        <w:trPr>
+          <w:cantSplit/>
+        </w:trPr>
         <w:tc>
           <w:tcPr>
             <w:tcW w:w="2000" w:type="dxa"/>
@@ -8189,6 +8271,9 @@
         </w:tc>
       </w:tr>
       <w:tr>
+        <w:trPr>
+          <w:cantSplit/>
+        </w:trPr>
         <w:tc>
           <w:tcPr>
             <w:tcW w:w="2000" w:type="dxa"/>
@@ -8272,6 +8357,9 @@
         </w:tc>
       </w:tr>
       <w:tr>
+        <w:trPr>
+          <w:cantSplit/>
+        </w:trPr>
         <w:tc>
           <w:tcPr>
             <w:tcW w:w="2000" w:type="dxa"/>
@@ -8355,6 +8443,9 @@
         </w:tc>
       </w:tr>
       <w:tr>
+        <w:trPr>
+          <w:cantSplit/>
+        </w:trPr>
         <w:tc>
           <w:tcPr>
             <w:tcW w:w="2000" w:type="dxa"/>
@@ -8438,6 +8529,9 @@
         </w:tc>
       </w:tr>
       <w:tr>
+        <w:trPr>
+          <w:cantSplit/>
+        </w:trPr>
         <w:tc>
           <w:tcPr>
             <w:tcW w:w="2000" w:type="dxa"/>
@@ -8521,6 +8615,9 @@
         </w:tc>
       </w:tr>
       <w:tr>
+        <w:trPr>
+          <w:cantSplit/>
+        </w:trPr>
         <w:tc>
           <w:tcPr>
             <w:tcW w:w="2000" w:type="dxa"/>
@@ -8604,6 +8701,9 @@
         </w:tc>
       </w:tr>
       <w:tr>
+        <w:trPr>
+          <w:cantSplit/>
+        </w:trPr>
         <w:tc>
           <w:tcPr>
             <w:tcW w:w="2000" w:type="dxa"/>
@@ -8687,6 +8787,9 @@
         </w:tc>
       </w:tr>
       <w:tr>
+        <w:trPr>
+          <w:cantSplit/>
+        </w:trPr>
         <w:tc>
           <w:tcPr>
             <w:tcW w:w="2000" w:type="dxa"/>
@@ -8770,6 +8873,9 @@
         </w:tc>
       </w:tr>
       <w:tr>
+        <w:trPr>
+          <w:cantSplit/>
+        </w:trPr>
         <w:tc>
           <w:tcPr>
             <w:tcW w:w="2000" w:type="dxa"/>
@@ -8950,7 +9056,7 @@
           <w:sz w:val="24"/>
           <w:szCs w:val="24"/>
         </w:rPr>
-        <w:t xml:space="preserve">Bảng 3. 3 Đối chiếu actor, BPMN và đối tượng phỏng vấn</w:t>
+        <w:t xml:space="preserve">Bảng 3.3 Đối chiếu actor, BPMN và đối tượng phỏng vấn</w:t>
       </w:r>
     </w:p>
     <w:tbl>
@@ -8981,6 +9087,7 @@
         <w:trPr>
           <w:jc w:val="center"/>
           <w:tblHeader/>
+          <w:cantSplit/>
         </w:trPr>
         <w:tc>
           <w:tcPr>
@@ -9129,6 +9236,9 @@
         </w:tc>
       </w:tr>
       <w:tr>
+        <w:trPr>
+          <w:cantSplit/>
+        </w:trPr>
         <w:tc>
           <w:tcPr>
             <w:tcW w:w="1700" w:type="dxa"/>
@@ -9266,6 +9376,9 @@
         </w:tc>
       </w:tr>
       <w:tr>
+        <w:trPr>
+          <w:cantSplit/>
+        </w:trPr>
         <w:tc>
           <w:tcPr>
             <w:tcW w:w="1700" w:type="dxa"/>
@@ -9403,6 +9516,9 @@
         </w:tc>
       </w:tr>
       <w:tr>
+        <w:trPr>
+          <w:cantSplit/>
+        </w:trPr>
         <w:tc>
           <w:tcPr>
             <w:tcW w:w="1700" w:type="dxa"/>
@@ -9540,6 +9656,9 @@
         </w:tc>
       </w:tr>
       <w:tr>
+        <w:trPr>
+          <w:cantSplit/>
+        </w:trPr>
         <w:tc>
           <w:tcPr>
             <w:tcW w:w="1700" w:type="dxa"/>
@@ -9677,6 +9796,9 @@
         </w:tc>
       </w:tr>
       <w:tr>
+        <w:trPr>
+          <w:cantSplit/>
+        </w:trPr>
         <w:tc>
           <w:tcPr>
             <w:tcW w:w="1700" w:type="dxa"/>
@@ -9827,7 +9949,7 @@
           <w:sz w:val="22"/>
           <w:szCs w:val="22"/>
         </w:rPr>
-        <w:t xml:space="preserve">Nguồn: Nhóm đối chiếu từ sơ đồ tổ chức (Hình 1. 2) và kiến trúc quy trình (Chương 2).</w:t>
+        <w:t xml:space="preserve">Nguồn: Nhóm đối chiếu từ sơ đồ tổ chức (Hình 1.2) và kiến trúc quy trình (Chương 2).</w:t>
       </w:r>
     </w:p>
     <w:p>
@@ -9878,7 +10000,7 @@
           <w:sz w:val="24"/>
           <w:szCs w:val="24"/>
         </w:rPr>
-        <w:t xml:space="preserve">Bảng 3. 4 Danh sách câu hỏi định tính</w:t>
+        <w:t xml:space="preserve">Bảng 3.4 Danh sách câu hỏi định tính</w:t>
       </w:r>
     </w:p>
     <w:tbl>
@@ -9909,6 +10031,7 @@
         <w:trPr>
           <w:jc w:val="center"/>
           <w:tblHeader/>
+          <w:cantSplit/>
         </w:trPr>
         <w:tc>
           <w:tcPr>
@@ -10057,6 +10180,9 @@
         </w:tc>
       </w:tr>
       <w:tr>
+        <w:trPr>
+          <w:cantSplit/>
+        </w:trPr>
         <w:tc>
           <w:tcPr>
             <w:tcW w:w="500" w:type="dxa"/>
@@ -10194,6 +10320,9 @@
         </w:tc>
       </w:tr>
       <w:tr>
+        <w:trPr>
+          <w:cantSplit/>
+        </w:trPr>
         <w:tc>
           <w:tcPr>
             <w:tcW w:w="500" w:type="dxa"/>
@@ -10331,6 +10460,9 @@
         </w:tc>
       </w:tr>
       <w:tr>
+        <w:trPr>
+          <w:cantSplit/>
+        </w:trPr>
         <w:tc>
           <w:tcPr>
             <w:tcW w:w="500" w:type="dxa"/>
@@ -10468,6 +10600,9 @@
         </w:tc>
       </w:tr>
       <w:tr>
+        <w:trPr>
+          <w:cantSplit/>
+        </w:trPr>
         <w:tc>
           <w:tcPr>
             <w:tcW w:w="500" w:type="dxa"/>
@@ -10605,6 +10740,9 @@
         </w:tc>
       </w:tr>
       <w:tr>
+        <w:trPr>
+          <w:cantSplit/>
+        </w:trPr>
         <w:tc>
           <w:tcPr>
             <w:tcW w:w="500" w:type="dxa"/>
@@ -10742,6 +10880,9 @@
         </w:tc>
       </w:tr>
       <w:tr>
+        <w:trPr>
+          <w:cantSplit/>
+        </w:trPr>
         <w:tc>
           <w:tcPr>
             <w:tcW w:w="500" w:type="dxa"/>
@@ -10879,6 +11020,9 @@
         </w:tc>
       </w:tr>
       <w:tr>
+        <w:trPr>
+          <w:cantSplit/>
+        </w:trPr>
         <w:tc>
           <w:tcPr>
             <w:tcW w:w="500" w:type="dxa"/>
@@ -11016,6 +11160,9 @@
         </w:tc>
       </w:tr>
       <w:tr>
+        <w:trPr>
+          <w:cantSplit/>
+        </w:trPr>
         <w:tc>
           <w:tcPr>
             <w:tcW w:w="500" w:type="dxa"/>
@@ -11153,6 +11300,9 @@
         </w:tc>
       </w:tr>
       <w:tr>
+        <w:trPr>
+          <w:cantSplit/>
+        </w:trPr>
         <w:tc>
           <w:tcPr>
             <w:tcW w:w="500" w:type="dxa"/>
@@ -11290,6 +11440,9 @@
         </w:tc>
       </w:tr>
       <w:tr>
+        <w:trPr>
+          <w:cantSplit/>
+        </w:trPr>
         <w:tc>
           <w:tcPr>
             <w:tcW w:w="500" w:type="dxa"/>
@@ -11458,7 +11611,7 @@
           <w:sz w:val="24"/>
           <w:szCs w:val="24"/>
         </w:rPr>
-        <w:t xml:space="preserve">Bảng 3. 5 Ghi nhận câu trả lời cho câu hỏi định tính có cấu trúc</w:t>
+        <w:t xml:space="preserve">Bảng 3.5 Ghi nhận câu trả lời cho câu hỏi định tính có cấu trúc</w:t>
       </w:r>
     </w:p>
     <w:tbl>
@@ -11492,6 +11645,7 @@
         <w:trPr>
           <w:jc w:val="center"/>
           <w:tblHeader/>
+          <w:cantSplit/>
         </w:trPr>
         <w:tc>
           <w:tcPr>
@@ -11727,6 +11881,9 @@
         </w:tc>
       </w:tr>
       <w:tr>
+        <w:trPr>
+          <w:cantSplit/>
+        </w:trPr>
         <w:tc>
           <w:tcPr>
             <w:tcW w:w="700" w:type="dxa"/>
@@ -11945,6 +12102,9 @@
         </w:tc>
       </w:tr>
       <w:tr>
+        <w:trPr>
+          <w:cantSplit/>
+        </w:trPr>
         <w:tc>
           <w:tcPr>
             <w:tcW w:w="700" w:type="dxa"/>
@@ -12163,6 +12323,9 @@
         </w:tc>
       </w:tr>
       <w:tr>
+        <w:trPr>
+          <w:cantSplit/>
+        </w:trPr>
         <w:tc>
           <w:tcPr>
             <w:tcW w:w="700" w:type="dxa"/>
@@ -12381,6 +12544,9 @@
         </w:tc>
       </w:tr>
       <w:tr>
+        <w:trPr>
+          <w:cantSplit/>
+        </w:trPr>
         <w:tc>
           <w:tcPr>
             <w:tcW w:w="700" w:type="dxa"/>
@@ -12599,6 +12765,9 @@
         </w:tc>
       </w:tr>
       <w:tr>
+        <w:trPr>
+          <w:cantSplit/>
+        </w:trPr>
         <w:tc>
           <w:tcPr>
             <w:tcW w:w="700" w:type="dxa"/>
@@ -12830,7 +12999,7 @@
           <w:sz w:val="22"/>
           <w:szCs w:val="22"/>
         </w:rPr>
-        <w:t xml:space="preserve">Ghi chú: Các cột “Câu trả lời thực tế”, “Giả thuyết”, “Nghi ngờ / chưa kiểm chứng” và “Minh chứng xác nhận” sẽ được nhóm hoàn thiện sau khi tiến hành phỏng vấn thực tế theo bộ câu hỏi tại Bảng 3. 4.</w:t>
+        <w:t xml:space="preserve">Ghi chú: Các cột “Câu trả lời thực tế”, “Giả thuyết”, “Nghi ngờ / chưa kiểm chứng” và “Minh chứng xác nhận” sẽ được nhóm hoàn thiện sau khi tiến hành phỏng vấn thực tế theo bộ câu hỏi tại Bảng 3.4.</w:t>
       </w:r>
     </w:p>
     <w:p>
@@ -12848,7 +13017,7 @@
           <w:sz w:val="24"/>
           <w:szCs w:val="24"/>
         </w:rPr>
-        <w:t xml:space="preserve">Bảng 3. 6 Danh sách câu hỏi định tính không có cấu trúc</w:t>
+        <w:t xml:space="preserve">Bảng 3.6 Danh sách câu hỏi định tính không có cấu trúc</w:t>
       </w:r>
     </w:p>
     <w:tbl>
@@ -12879,6 +13048,7 @@
         <w:trPr>
           <w:jc w:val="center"/>
           <w:tblHeader/>
+          <w:cantSplit/>
         </w:trPr>
         <w:tc>
           <w:tcPr>
@@ -13027,6 +13197,9 @@
         </w:tc>
       </w:tr>
       <w:tr>
+        <w:trPr>
+          <w:cantSplit/>
+        </w:trPr>
         <w:tc>
           <w:tcPr>
             <w:tcW w:w="700" w:type="dxa"/>
@@ -13164,6 +13337,9 @@
         </w:tc>
       </w:tr>
       <w:tr>
+        <w:trPr>
+          <w:cantSplit/>
+        </w:trPr>
         <w:tc>
           <w:tcPr>
             <w:tcW w:w="700" w:type="dxa"/>
@@ -13301,6 +13477,9 @@
         </w:tc>
       </w:tr>
       <w:tr>
+        <w:trPr>
+          <w:cantSplit/>
+        </w:trPr>
         <w:tc>
           <w:tcPr>
             <w:tcW w:w="700" w:type="dxa"/>
@@ -13438,6 +13617,9 @@
         </w:tc>
       </w:tr>
       <w:tr>
+        <w:trPr>
+          <w:cantSplit/>
+        </w:trPr>
         <w:tc>
           <w:tcPr>
             <w:tcW w:w="700" w:type="dxa"/>
@@ -13575,6 +13757,9 @@
         </w:tc>
       </w:tr>
       <w:tr>
+        <w:trPr>
+          <w:cantSplit/>
+        </w:trPr>
         <w:tc>
           <w:tcPr>
             <w:tcW w:w="700" w:type="dxa"/>
@@ -13776,7 +13961,7 @@
           <w:sz w:val="24"/>
           <w:szCs w:val="24"/>
         </w:rPr>
-        <w:t xml:space="preserve">Bảng 3. 7 Danh sách câu hỏi định lượng</w:t>
+        <w:t xml:space="preserve">Bảng 3.7 Danh sách câu hỏi định lượng</w:t>
       </w:r>
     </w:p>
     <w:tbl>
@@ -13807,6 +13992,7 @@
         <w:trPr>
           <w:jc w:val="center"/>
           <w:tblHeader/>
+          <w:cantSplit/>
         </w:trPr>
         <w:tc>
           <w:tcPr>
@@ -13955,6 +14141,9 @@
         </w:tc>
       </w:tr>
       <w:tr>
+        <w:trPr>
+          <w:cantSplit/>
+        </w:trPr>
         <w:tc>
           <w:tcPr>
             <w:tcW w:w="500" w:type="dxa"/>
@@ -14092,6 +14281,9 @@
         </w:tc>
       </w:tr>
       <w:tr>
+        <w:trPr>
+          <w:cantSplit/>
+        </w:trPr>
         <w:tc>
           <w:tcPr>
             <w:tcW w:w="500" w:type="dxa"/>
@@ -14229,6 +14421,9 @@
         </w:tc>
       </w:tr>
       <w:tr>
+        <w:trPr>
+          <w:cantSplit/>
+        </w:trPr>
         <w:tc>
           <w:tcPr>
             <w:tcW w:w="500" w:type="dxa"/>
@@ -14366,6 +14561,9 @@
         </w:tc>
       </w:tr>
       <w:tr>
+        <w:trPr>
+          <w:cantSplit/>
+        </w:trPr>
         <w:tc>
           <w:tcPr>
             <w:tcW w:w="500" w:type="dxa"/>
@@ -14503,6 +14701,9 @@
         </w:tc>
       </w:tr>
       <w:tr>
+        <w:trPr>
+          <w:cantSplit/>
+        </w:trPr>
         <w:tc>
           <w:tcPr>
             <w:tcW w:w="500" w:type="dxa"/>
@@ -14640,6 +14841,9 @@
         </w:tc>
       </w:tr>
       <w:tr>
+        <w:trPr>
+          <w:cantSplit/>
+        </w:trPr>
         <w:tc>
           <w:tcPr>
             <w:tcW w:w="500" w:type="dxa"/>
@@ -14777,6 +14981,9 @@
         </w:tc>
       </w:tr>
       <w:tr>
+        <w:trPr>
+          <w:cantSplit/>
+        </w:trPr>
         <w:tc>
           <w:tcPr>
             <w:tcW w:w="500" w:type="dxa"/>
@@ -14914,6 +15121,9 @@
         </w:tc>
       </w:tr>
       <w:tr>
+        <w:trPr>
+          <w:cantSplit/>
+        </w:trPr>
         <w:tc>
           <w:tcPr>
             <w:tcW w:w="500" w:type="dxa"/>
@@ -15051,6 +15261,9 @@
         </w:tc>
       </w:tr>
       <w:tr>
+        <w:trPr>
+          <w:cantSplit/>
+        </w:trPr>
         <w:tc>
           <w:tcPr>
             <w:tcW w:w="500" w:type="dxa"/>
@@ -15188,6 +15401,9 @@
         </w:tc>
       </w:tr>
       <w:tr>
+        <w:trPr>
+          <w:cantSplit/>
+        </w:trPr>
         <w:tc>
           <w:tcPr>
             <w:tcW w:w="500" w:type="dxa"/>
@@ -15356,7 +15572,7 @@
           <w:sz w:val="24"/>
           <w:szCs w:val="24"/>
         </w:rPr>
-        <w:t xml:space="preserve">Bảng 3. 8 Ghi nhận câu trả lời cho câu hỏi định lượng có cấu trúc</w:t>
+        <w:t xml:space="preserve">Bảng 3.8 Ghi nhận câu trả lời cho câu hỏi định lượng có cấu trúc</w:t>
       </w:r>
     </w:p>
     <w:tbl>
@@ -15390,6 +15606,7 @@
         <w:trPr>
           <w:jc w:val="center"/>
           <w:tblHeader/>
+          <w:cantSplit/>
         </w:trPr>
         <w:tc>
           <w:tcPr>
@@ -15625,6 +15842,9 @@
         </w:tc>
       </w:tr>
       <w:tr>
+        <w:trPr>
+          <w:cantSplit/>
+        </w:trPr>
         <w:tc>
           <w:tcPr>
             <w:tcW w:w="700" w:type="dxa"/>
@@ -15843,6 +16063,9 @@
         </w:tc>
       </w:tr>
       <w:tr>
+        <w:trPr>
+          <w:cantSplit/>
+        </w:trPr>
         <w:tc>
           <w:tcPr>
             <w:tcW w:w="700" w:type="dxa"/>
@@ -16061,6 +16284,9 @@
         </w:tc>
       </w:tr>
       <w:tr>
+        <w:trPr>
+          <w:cantSplit/>
+        </w:trPr>
         <w:tc>
           <w:tcPr>
             <w:tcW w:w="700" w:type="dxa"/>
@@ -16279,6 +16505,9 @@
         </w:tc>
       </w:tr>
       <w:tr>
+        <w:trPr>
+          <w:cantSplit/>
+        </w:trPr>
         <w:tc>
           <w:tcPr>
             <w:tcW w:w="700" w:type="dxa"/>
@@ -16497,6 +16726,9 @@
         </w:tc>
       </w:tr>
       <w:tr>
+        <w:trPr>
+          <w:cantSplit/>
+        </w:trPr>
         <w:tc>
           <w:tcPr>
             <w:tcW w:w="700" w:type="dxa"/>
@@ -16728,7 +16960,7 @@
           <w:sz w:val="22"/>
           <w:szCs w:val="22"/>
         </w:rPr>
-        <w:t xml:space="preserve">Ghi chú: Các cột “Câu trả lời thực tế”, “Giả thuyết”, “Nghi ngờ / chưa kiểm chứng” và “Minh chứng xác nhận” sẽ được nhóm hoàn thiện sau khi tiến hành khảo sát định lượng thực tế theo bộ câu hỏi tại Bảng 3. 7.</w:t>
+        <w:t xml:space="preserve">Ghi chú: Các cột “Câu trả lời thực tế”, “Giả thuyết”, “Nghi ngờ / chưa kiểm chứng” và “Minh chứng xác nhận” sẽ được nhóm hoàn thiện sau khi tiến hành khảo sát định lượng thực tế theo bộ câu hỏi tại Bảng 3.7.</w:t>
       </w:r>
     </w:p>
     <w:p>
@@ -16746,7 +16978,7 @@
           <w:sz w:val="24"/>
           <w:szCs w:val="24"/>
         </w:rPr>
-        <w:t xml:space="preserve">Bảng 3. 9 Danh sách câu hỏi định lượng không có cấu trúc</w:t>
+        <w:t xml:space="preserve">Bảng 3.9 Danh sách câu hỏi định lượng không có cấu trúc</w:t>
       </w:r>
     </w:p>
     <w:tbl>
@@ -16777,6 +17009,7 @@
         <w:trPr>
           <w:jc w:val="center"/>
           <w:tblHeader/>
+          <w:cantSplit/>
         </w:trPr>
         <w:tc>
           <w:tcPr>
@@ -16925,6 +17158,9 @@
         </w:tc>
       </w:tr>
       <w:tr>
+        <w:trPr>
+          <w:cantSplit/>
+        </w:trPr>
         <w:tc>
           <w:tcPr>
             <w:tcW w:w="700" w:type="dxa"/>
@@ -17062,6 +17298,9 @@
         </w:tc>
       </w:tr>
       <w:tr>
+        <w:trPr>
+          <w:cantSplit/>
+        </w:trPr>
         <w:tc>
           <w:tcPr>
             <w:tcW w:w="700" w:type="dxa"/>
@@ -17199,6 +17438,9 @@
         </w:tc>
       </w:tr>
       <w:tr>
+        <w:trPr>
+          <w:cantSplit/>
+        </w:trPr>
         <w:tc>
           <w:tcPr>
             <w:tcW w:w="700" w:type="dxa"/>
@@ -17336,6 +17578,9 @@
         </w:tc>
       </w:tr>
       <w:tr>
+        <w:trPr>
+          <w:cantSplit/>
+        </w:trPr>
         <w:tc>
           <w:tcPr>
             <w:tcW w:w="700" w:type="dxa"/>
@@ -17473,6 +17718,9 @@
         </w:tc>
       </w:tr>
       <w:tr>
+        <w:trPr>
+          <w:cantSplit/>
+        </w:trPr>
         <w:tc>
           <w:tcPr>
             <w:tcW w:w="700" w:type="dxa"/>

</xml_diff>